<commit_message>
Update the references in the doc
</commit_message>
<xml_diff>
--- a/Week2/DevEnv Setup.docx
+++ b/Week2/DevEnv Setup.docx
@@ -211,6 +211,9 @@
     </w:p>
     <w:p>
       <w:r>
+        <w:rPr>
+          <w:noProof/>
+        </w:rPr>
         <w:drawing>
           <wp:anchor distT="0" distB="0" distL="114300" distR="114300" simplePos="0" relativeHeight="251655168" behindDoc="0" locked="0" layoutInCell="1" allowOverlap="1" wp14:anchorId="47CE287E" wp14:editId="383AACE9">
             <wp:simplePos x="0" y="0"/>
@@ -268,6 +271,9 @@
         </w:drawing>
       </w:r>
       <w:r>
+        <w:rPr>
+          <w:noProof/>
+        </w:rPr>
         <w:drawing>
           <wp:anchor distT="0" distB="0" distL="114300" distR="114300" simplePos="0" relativeHeight="251656192" behindDoc="0" locked="0" layoutInCell="1" allowOverlap="1" wp14:anchorId="71389ED5" wp14:editId="3E0826DC">
             <wp:simplePos x="0" y="0"/>
@@ -386,6 +392,9 @@
     </w:p>
     <w:p>
       <w:r>
+        <w:rPr>
+          <w:noProof/>
+        </w:rPr>
         <w:drawing>
           <wp:anchor distT="0" distB="0" distL="114300" distR="114300" simplePos="0" relativeHeight="251657216" behindDoc="0" locked="0" layoutInCell="1" allowOverlap="1" wp14:anchorId="679EC750" wp14:editId="5CEE3183">
             <wp:simplePos x="0" y="0"/>
@@ -678,6 +687,9 @@
     </w:p>
     <w:p>
       <w:r>
+        <w:rPr>
+          <w:noProof/>
+        </w:rPr>
         <w:drawing>
           <wp:anchor distT="0" distB="0" distL="114300" distR="114300" simplePos="0" relativeHeight="251669504" behindDoc="0" locked="0" layoutInCell="1" allowOverlap="1" wp14:anchorId="3A73C469" wp14:editId="64DEB892">
             <wp:simplePos x="0" y="0"/>
@@ -1239,6 +1251,7 @@
         <w:rPr>
           <w:b/>
           <w:bCs/>
+          <w:noProof/>
         </w:rPr>
         <w:drawing>
           <wp:anchor distT="0" distB="0" distL="114300" distR="114300" simplePos="0" relativeHeight="251674624" behindDoc="0" locked="0" layoutInCell="1" allowOverlap="1" wp14:anchorId="0507448F" wp14:editId="4804A089">
@@ -1305,13 +1318,7 @@
       </w:r>
       <w:proofErr w:type="spellEnd"/>
       <w:r>
-        <w:t xml:space="preserve"> file that reproduces my exact environment. </w:t>
-      </w:r>
-      <w:r>
-        <w:t>I ensure the notebook and this document live inside Week 2</w:t>
-      </w:r>
-      <w:r>
-        <w:t xml:space="preserve"> and push to GitHub. </w:t>
+        <w:t xml:space="preserve"> file that reproduces my exact environment. I ensure the notebook and this document live inside Week 2 and push to GitHub. </w:t>
       </w:r>
     </w:p>
     <w:p>
@@ -1385,8 +1392,30 @@
           <w:kern w:val="0"/>
           <w14:ligatures w14:val="none"/>
         </w:rPr>
-        <w:t>. https://www.anaconda.com/docs/getting-started/working-with-conda/conda-intro-tutorial</w:t>
-      </w:r>
+        <w:t xml:space="preserve">. </w:t>
+      </w:r>
+      <w:hyperlink r:id="rId23" w:history="1">
+        <w:r>
+          <w:rPr>
+            <w:rStyle w:val="Hyperlink"/>
+            <w:rFonts w:eastAsia="Times New Roman" w:cs="Times New Roman"/>
+            <w:kern w:val="0"/>
+            <w14:ligatures w14:val="none"/>
+          </w:rPr>
+          <w:t>https://www.anaconda.com/docs/getting-started/working-with-conda/conda-intro-tutorial</w:t>
+        </w:r>
+      </w:hyperlink>
+    </w:p>
+    <w:p>
+      <w:pPr>
+        <w:spacing w:after="0" w:line="240" w:lineRule="auto"/>
+        <w:ind w:left="720" w:hanging="720"/>
+        <w:rPr>
+          <w:rFonts w:eastAsia="Times New Roman" w:cs="Times New Roman"/>
+          <w:kern w:val="0"/>
+          <w14:ligatures w14:val="none"/>
+        </w:rPr>
+      </w:pPr>
     </w:p>
     <w:p>
       <w:pPr>
@@ -1414,13 +1443,35 @@
           <w:kern w:val="0"/>
           <w14:ligatures w14:val="none"/>
         </w:rPr>
-        <w:t>. https://www.anaconda.com/docs/getting-started/miniconda/install/mac-gui-install</w:t>
-      </w:r>
+        <w:t xml:space="preserve">. </w:t>
+      </w:r>
+      <w:hyperlink r:id="rId24" w:history="1">
+        <w:r>
+          <w:rPr>
+            <w:rStyle w:val="Hyperlink"/>
+            <w:rFonts w:eastAsia="Times New Roman" w:cs="Times New Roman"/>
+            <w:kern w:val="0"/>
+            <w14:ligatures w14:val="none"/>
+          </w:rPr>
+          <w:t>https://www.anaconda.com/docs/getting-started/miniconda/install/mac-gui-install</w:t>
+        </w:r>
+      </w:hyperlink>
     </w:p>
     <w:p>
       <w:pPr>
         <w:spacing w:after="0" w:line="240" w:lineRule="auto"/>
-        <w:ind w:left="720" w:hanging="720"/>
+        <w:rPr>
+          <w:rFonts w:ascii="Times New Roman" w:eastAsia="Times New Roman" w:hAnsi="Times New Roman" w:cs="Times New Roman"/>
+          <w:i/>
+          <w:iCs/>
+          <w:kern w:val="0"/>
+          <w14:ligatures w14:val="none"/>
+        </w:rPr>
+      </w:pPr>
+    </w:p>
+    <w:p>
+      <w:pPr>
+        <w:spacing w:after="0" w:line="240" w:lineRule="auto"/>
         <w:rPr>
           <w:rFonts w:eastAsia="Times New Roman" w:cs="Times New Roman"/>
           <w:kern w:val="0"/>
@@ -1435,7 +1486,7 @@
           <w:kern w:val="0"/>
           <w14:ligatures w14:val="none"/>
         </w:rPr>
-        <w:t>macOS graphical installer - Anaconda</w:t>
+        <w:t>Lorenz system - Wikipedia</w:t>
       </w:r>
       <w:r>
         <w:rPr>
@@ -1443,8 +1494,30 @@
           <w:kern w:val="0"/>
           <w14:ligatures w14:val="none"/>
         </w:rPr>
-        <w:t>. https://www.anaconda.com/docs/getting-started/miniconda/install/mac-gui-install</w:t>
-      </w:r>
+        <w:t xml:space="preserve">. </w:t>
+      </w:r>
+      <w:hyperlink r:id="rId25" w:history="1">
+        <w:r>
+          <w:rPr>
+            <w:rStyle w:val="Hyperlink"/>
+            <w:rFonts w:eastAsia="Times New Roman" w:cs="Times New Roman"/>
+            <w:kern w:val="0"/>
+            <w14:ligatures w14:val="none"/>
+          </w:rPr>
+          <w:t>https://en.wikipedia.org/wiki/Lorenz_system</w:t>
+        </w:r>
+      </w:hyperlink>
+    </w:p>
+    <w:p>
+      <w:pPr>
+        <w:spacing w:after="0" w:line="240" w:lineRule="auto"/>
+        <w:ind w:left="720" w:hanging="720"/>
+        <w:rPr>
+          <w:rFonts w:eastAsia="Times New Roman" w:cs="Times New Roman"/>
+          <w:kern w:val="0"/>
+          <w14:ligatures w14:val="none"/>
+        </w:rPr>
+      </w:pPr>
     </w:p>
     <w:p>
       <w:pPr>
@@ -1464,27 +1537,7 @@
           <w:kern w:val="0"/>
           <w14:ligatures w14:val="none"/>
         </w:rPr>
-        <w:t xml:space="preserve">Lorenz attractor </w:t>
-      </w:r>
-      <w:r>
-        <w:rPr>
-          <w:rFonts w:eastAsia="Times New Roman" w:cs="Times New Roman"/>
-          <w:i/>
-          <w:iCs/>
-          <w:kern w:val="0"/>
-          <w14:ligatures w14:val="none"/>
-        </w:rPr>
-        <w:t>-</w:t>
-      </w:r>
-      <w:r>
-        <w:rPr>
-          <w:rFonts w:eastAsia="Times New Roman" w:cs="Times New Roman"/>
-          <w:i/>
-          <w:iCs/>
-          <w:kern w:val="0"/>
-          <w14:ligatures w14:val="none"/>
-        </w:rPr>
-        <w:t xml:space="preserve"> Matplotlib 3.10.9 documentation</w:t>
+        <w:t>Lorenz attractor - Matplotlib 3.10.9 documentation</w:t>
       </w:r>
       <w:r>
         <w:rPr>
@@ -1492,8 +1545,30 @@
           <w:kern w:val="0"/>
           <w14:ligatures w14:val="none"/>
         </w:rPr>
-        <w:t>. https://matplotlib.org/stable/gallery/mplot3d/lorenz_attractor.html</w:t>
-      </w:r>
+        <w:t xml:space="preserve">. </w:t>
+      </w:r>
+      <w:hyperlink r:id="rId26" w:history="1">
+        <w:r>
+          <w:rPr>
+            <w:rStyle w:val="Hyperlink"/>
+            <w:rFonts w:eastAsia="Times New Roman" w:cs="Times New Roman"/>
+            <w:kern w:val="0"/>
+            <w14:ligatures w14:val="none"/>
+          </w:rPr>
+          <w:t>https://matplotlib.org/stable/gallery/mplot3d/lorenz_attractor.html</w:t>
+        </w:r>
+      </w:hyperlink>
+    </w:p>
+    <w:p>
+      <w:pPr>
+        <w:spacing w:after="0" w:line="240" w:lineRule="auto"/>
+        <w:ind w:left="720" w:hanging="720"/>
+        <w:rPr>
+          <w:rFonts w:eastAsia="Times New Roman" w:cs="Times New Roman"/>
+          <w:kern w:val="0"/>
+          <w14:ligatures w14:val="none"/>
+        </w:rPr>
+      </w:pPr>
     </w:p>
     <w:p>
       <w:pPr>
@@ -2429,6 +2504,29 @@
       <w:spacing w:val="5"/>
     </w:rPr>
   </w:style>
+  <w:style w:type="character" w:styleId="Hyperlink">
+    <w:name w:val="Hyperlink"/>
+    <w:basedOn w:val="DefaultParagraphFont"/>
+    <w:uiPriority w:val="99"/>
+    <w:unhideWhenUsed/>
+    <w:rsid w:val="006628F5"/>
+    <w:rPr>
+      <w:color w:val="467886" w:themeColor="hyperlink"/>
+      <w:u w:val="single"/>
+    </w:rPr>
+  </w:style>
+  <w:style w:type="character" w:styleId="UnresolvedMention">
+    <w:name w:val="Unresolved Mention"/>
+    <w:basedOn w:val="DefaultParagraphFont"/>
+    <w:uiPriority w:val="99"/>
+    <w:semiHidden/>
+    <w:unhideWhenUsed/>
+    <w:rsid w:val="006628F5"/>
+    <w:rPr>
+      <w:color w:val="605E5C"/>
+      <w:shd w:val="clear" w:color="auto" w:fill="E1DFDD"/>
+    </w:rPr>
+  </w:style>
 </w:styles>
 </file>
 

</xml_diff>